<commit_message>
Docker deployment migration, citation-precision fix, security headers, PDF citation fix, evaluation harness, semantic ranking eval, design doc
</commit_message>
<xml_diff>
--- a/corpus/policies/pto-policy.docx
+++ b/corpus/policies/pto-policy.docx
@@ -201,38 +201,6 @@
         <w:spacing w:line="276" w:lineRule="auto"/>
         <w:rPr>
           <w:rFonts w:ascii="Lato" w:cs="Lato" w:eastAsia="Lato" w:hAnsi="Lato"/>
-          <w:i w:val="1"/>
-          <w:sz w:val="16"/>
-          <w:szCs w:val="16"/>
-        </w:rPr>
-      </w:pPr>
-      <w:r>
-        <w:rPr>
-          <w:rFonts w:ascii="Lato" w:cs="Lato" w:eastAsia="Lato" w:hAnsi="Lato"/>
-          <w:b w:val="1"/>
-          <w:i w:val="1"/>
-          <w:sz w:val="16"/>
-          <w:szCs w:val="16"/>
-          <w:rtl w:val="0"/>
-        </w:rPr>
-        <w:t xml:space="preserve">Disclaimer:</w:t>
-      </w:r>
-      <w:r>
-        <w:rPr>
-          <w:rFonts w:ascii="Lato" w:cs="Lato" w:eastAsia="Lato" w:hAnsi="Lato"/>
-          <w:i w:val="1"/>
-          <w:sz w:val="16"/>
-          <w:szCs w:val="16"/>
-          <w:rtl w:val="0"/>
-        </w:rPr>
-        <w:t xml:space="preserve"> Policy should be reviewed by legal counsel to ensure that all local, state, and federal regulations have been met. Please do so before making it available to your employees.</w:t>
-      </w:r>
-    </w:p>
-    <w:p>
-      <w:pPr>
-        <w:spacing w:line="276" w:lineRule="auto"/>
-        <w:rPr>
-          <w:rFonts w:ascii="Lato" w:cs="Lato" w:eastAsia="Lato" w:hAnsi="Lato"/>
           <w:sz w:val="28"/>
           <w:szCs w:val="28"/>
         </w:rPr>
@@ -891,20 +859,11 @@
         </w:rPr>
       </w:pPr>
       <w:r>
-        <w:rPr>
-          <w:rFonts w:ascii="Lato" w:cs="Lato" w:eastAsia="Lato" w:hAnsi="Lato"/>
-          <w:rtl w:val="0"/>
-        </w:rPr>
-        <w:br w:type="textWrapping"/>
-        <w:t xml:space="preserve">Request your time off through [describe how to do it with your current systems; typically, at least written notice is required, like an email]. Once approved, add the time off to your calendar. </w:t>
-        <w:br w:type="textWrapping"/>
-        <w:br w:type="textWrapping"/>
+        <w:br/>
+        <w:t xml:space="preserve">Request your time off through the HRIS time-off request workflow. If HRIS is unavailable, provide written notice to your manager by email. Once approved, add the time off to your calendar. </w:t>
+        <w:br/>
+        <w:br/>
         <w:t xml:space="preserve">Beyond that, employees are encouraged to: </w:t>
-      </w:r>
-      <w:r>
-        <w:rPr>
-          <w:rtl w:val="0"/>
-        </w:rPr>
       </w:r>
     </w:p>
     <w:p>

</xml_diff>